<commit_message>
adaugare clienti in DB si testare app
</commit_message>
<xml_diff>
--- a/comanda creare exe.docx
+++ b/comanda creare exe.docx
@@ -3,26 +3,68 @@
 <w:document xmlns:wpc="http://schemas.microsoft.com/office/word/2010/wordprocessingCanvas" xmlns:cx="http://schemas.microsoft.com/office/drawing/2014/chartex" xmlns:cx1="http://schemas.microsoft.com/office/drawing/2015/9/8/chartex" xmlns:cx2="http://schemas.microsoft.com/office/drawing/2015/10/21/chartex" xmlns:cx3="http://schemas.microsoft.com/office/drawing/2016/5/9/chartex" xmlns:cx4="http://schemas.microsoft.com/office/drawing/2016/5/10/chartex" xmlns:cx5="http://schemas.microsoft.com/office/drawing/2016/5/11/chartex" xmlns:cx6="http://schemas.microsoft.com/office/drawing/2016/5/12/chartex" xmlns:cx7="http://schemas.microsoft.com/office/drawing/2016/5/13/chartex" xmlns:cx8="http://schemas.microsoft.com/office/drawing/2016/5/14/chartex" xmlns:mc="http://schemas.openxmlformats.org/markup-compatibility/2006" xmlns:aink="http://schemas.microsoft.com/office/drawing/2016/ink" xmlns:am3d="http://schemas.microsoft.com/office/drawing/2017/model3d" xmlns:o="urn:schemas-microsoft-com:office:office" xmlns:oel="http://schemas.microsoft.com/office/2019/extlst" xmlns:r="http://schemas.openxmlformats.org/officeDocument/2006/relationships" xmlns:m="http://schemas.openxmlformats.org/officeDocument/2006/math" xmlns:v="urn:schemas-microsoft-com:vml" xmlns:wp14="http://schemas.microsoft.com/office/word/2010/wordprocessingDrawing" xmlns:wp="http://schemas.openxmlformats.org/drawingml/2006/wordprocessingDrawing" xmlns:w10="urn:schemas-microsoft-com:office:word" xmlns:w="http://schemas.openxmlformats.org/wordprocessingml/2006/main" xmlns:w14="http://schemas.microsoft.com/office/word/2010/wordml" xmlns:w15="http://schemas.microsoft.com/office/word/2012/wordml" xmlns:w16cex="http://schemas.microsoft.com/office/word/2018/wordml/cex" xmlns:w16cid="http://schemas.microsoft.com/office/word/2016/wordml/cid" xmlns:w16="http://schemas.microsoft.com/office/word/2018/wordml" xmlns:w16du="http://schemas.microsoft.com/office/word/2023/wordml/word16du" xmlns:w16sdtdh="http://schemas.microsoft.com/office/word/2020/wordml/sdtdatahash" xmlns:w16sdtfl="http://schemas.microsoft.com/office/word/2024/wordml/sdtformatlock" xmlns:w16se="http://schemas.microsoft.com/office/word/2015/wordml/symex" xmlns:wpg="http://schemas.microsoft.com/office/word/2010/wordprocessingGroup" xmlns:wpi="http://schemas.microsoft.com/office/word/2010/wordprocessingInk" xmlns:wne="http://schemas.microsoft.com/office/word/2006/wordml" xmlns:wps="http://schemas.microsoft.com/office/word/2010/wordprocessingShape" mc:Ignorable="w14 w15 w16se w16cid w16 w16cex w16sdtdh w16sdtfl w16du wp14">
   <w:body>
     <w:p>
-      <w:r>
-        <w:t xml:space="preserve">pyinstaller --onefile --noconsole </w:t>
-      </w:r>
+      <w:proofErr w:type="spellStart"/>
+      <w:r>
+        <w:t>pyinstaller</w:t>
+      </w:r>
+      <w:proofErr w:type="spellEnd"/>
+      <w:r>
+        <w:t xml:space="preserve"> --</w:t>
+      </w:r>
+      <w:proofErr w:type="spellStart"/>
+      <w:r>
+        <w:t>onefile</w:t>
+      </w:r>
+      <w:proofErr w:type="spellEnd"/>
+      <w:r>
+        <w:t xml:space="preserve"> --</w:t>
+      </w:r>
+      <w:proofErr w:type="spellStart"/>
+      <w:r>
+        <w:t>noconsole</w:t>
+      </w:r>
+      <w:proofErr w:type="spellEnd"/>
       <w:r>
         <w:t xml:space="preserve"> </w:t>
       </w:r>
       <w:r>
-        <w:t xml:space="preserve">--hidden-import=babel.numbers </w:t>
-      </w:r>
-      <w:r>
         <w:t xml:space="preserve"> </w:t>
       </w:r>
       <w:r>
-        <w:t>--hidden-import=babel.localedata</w:t>
-      </w:r>
+        <w:t>--hidden-import=</w:t>
+      </w:r>
+      <w:proofErr w:type="spellStart"/>
+      <w:r>
+        <w:t>babel.numbers</w:t>
+      </w:r>
+      <w:proofErr w:type="spellEnd"/>
       <w:r>
         <w:t xml:space="preserve"> </w:t>
       </w:r>
       <w:r>
-        <w:t xml:space="preserve">--hidden-import=babel.dates </w:t>
+        <w:t xml:space="preserve"> </w:t>
+      </w:r>
+      <w:r>
+        <w:t>--hidden-import=</w:t>
+      </w:r>
+      <w:proofErr w:type="spellStart"/>
+      <w:r>
+        <w:t>babel.localedata</w:t>
+      </w:r>
+      <w:proofErr w:type="spellEnd"/>
+      <w:r>
+        <w:t xml:space="preserve"> </w:t>
+      </w:r>
+      <w:r>
+        <w:t>--hidden-import=</w:t>
+      </w:r>
+      <w:proofErr w:type="spellStart"/>
+      <w:r>
+        <w:t>babel.dates</w:t>
+      </w:r>
+      <w:proofErr w:type="spellEnd"/>
+      <w:r>
+        <w:t xml:space="preserve"> </w:t>
       </w:r>
       <w:r>
         <w:t xml:space="preserve"> --clean </w:t>
@@ -35,6 +77,95 @@
       </w:r>
     </w:p>
     <w:p/>
+    <w:p>
+      <w:proofErr w:type="spellStart"/>
+      <w:r>
+        <w:t>adaugi</w:t>
+      </w:r>
+      <w:proofErr w:type="spellEnd"/>
+      <w:r>
+        <w:t xml:space="preserve"> icons </w:t>
+      </w:r>
+    </w:p>
+    <w:p>
+      <w:proofErr w:type="spellStart"/>
+      <w:r>
+        <w:t>pyinstaller</w:t>
+      </w:r>
+      <w:proofErr w:type="spellEnd"/>
+      <w:r>
+        <w:t xml:space="preserve"> --</w:t>
+      </w:r>
+      <w:proofErr w:type="spellStart"/>
+      <w:r>
+        <w:t>onefile</w:t>
+      </w:r>
+      <w:proofErr w:type="spellEnd"/>
+      <w:r>
+        <w:t xml:space="preserve"> --add-data "</w:t>
+      </w:r>
+      <w:proofErr w:type="spellStart"/>
+      <w:r>
+        <w:t>icons;icons</w:t>
+      </w:r>
+      <w:proofErr w:type="spellEnd"/>
+      <w:r>
+        <w:t>" main.py</w:t>
+      </w:r>
+    </w:p>
+    <w:p/>
+    <w:p>
+      <w:proofErr w:type="spellStart"/>
+      <w:r>
+        <w:t>Dacă</w:t>
+      </w:r>
+      <w:proofErr w:type="spellEnd"/>
+      <w:r>
+        <w:t xml:space="preserve"> e Windows PowerShell </w:t>
+      </w:r>
+      <w:proofErr w:type="spellStart"/>
+      <w:r>
+        <w:t>și</w:t>
+      </w:r>
+      <w:proofErr w:type="spellEnd"/>
+      <w:r>
+        <w:t xml:space="preserve"> </w:t>
+      </w:r>
+      <w:proofErr w:type="spellStart"/>
+      <w:r>
+        <w:t>dă</w:t>
+      </w:r>
+      <w:proofErr w:type="spellEnd"/>
+      <w:r>
+        <w:t xml:space="preserve"> eroare:</w:t>
+      </w:r>
+    </w:p>
+    <w:p>
+      <w:proofErr w:type="spellStart"/>
+      <w:r>
+        <w:t>pyinstaller</w:t>
+      </w:r>
+      <w:proofErr w:type="spellEnd"/>
+      <w:r>
+        <w:t xml:space="preserve"> --</w:t>
+      </w:r>
+      <w:proofErr w:type="spellStart"/>
+      <w:r>
+        <w:t>onefile</w:t>
+      </w:r>
+      <w:proofErr w:type="spellEnd"/>
+      <w:r>
+        <w:t xml:space="preserve"> --add-data "</w:t>
+      </w:r>
+      <w:proofErr w:type="spellStart"/>
+      <w:r>
+        <w:t>icons;icons</w:t>
+      </w:r>
+      <w:proofErr w:type="spellEnd"/>
+      <w:r>
+        <w:t>" --hidden-import PIL main.py</w:t>
+      </w:r>
+    </w:p>
     <w:sectPr>
       <w:pgSz w:w="12240" w:h="15840"/>
       <w:pgMar w:top="1440" w:right="1440" w:bottom="1440" w:left="1440" w:header="720" w:footer="720" w:gutter="0"/>
@@ -648,7 +779,6 @@
   <w:style w:type="character" w:default="1" w:styleId="DefaultParagraphFont">
     <w:name w:val="Default Paragraph Font"/>
     <w:uiPriority w:val="1"/>
-    <w:semiHidden/>
     <w:unhideWhenUsed/>
   </w:style>
   <w:style w:type="table" w:default="1" w:styleId="TableNormal">

</xml_diff>